<commit_message>
Updated docs & README.md
</commit_message>
<xml_diff>
--- a/docs/concept-note.docx
+++ b/docs/concept-note.docx
@@ -96,39 +96,7 @@
           <w:sz w:val="22"/>
           <w:szCs w:val="22"/>
         </w:rPr>
-        <w:t xml:space="preserve">From my observation, the process of issuing cards to registered students includes a wait period of about a week after registration </w:t>
-      </w:r>
-      <w:r>
-        <w:rPr>
-          <w:rFonts w:ascii="Courier New" w:hAnsi="Courier New"/>
-          <w:sz w:val="22"/>
-          <w:szCs w:val="22"/>
-        </w:rPr>
-        <w:t>up to the card availability</w:t>
-      </w:r>
-      <w:r>
-        <w:rPr>
-          <w:rFonts w:ascii="Courier New" w:hAnsi="Courier New"/>
-          <w:sz w:val="22"/>
-          <w:szCs w:val="22"/>
-        </w:rPr>
-        <w:t xml:space="preserve">. </w:t>
-      </w:r>
-      <w:r>
-        <w:rPr>
-          <w:rFonts w:ascii="Courier New" w:hAnsi="Courier New"/>
-          <w:sz w:val="22"/>
-          <w:szCs w:val="22"/>
-        </w:rPr>
-        <w:t>Thereafter, s</w:t>
-      </w:r>
-      <w:r>
-        <w:rPr>
-          <w:rFonts w:ascii="Courier New" w:hAnsi="Courier New"/>
-          <w:sz w:val="22"/>
-          <w:szCs w:val="22"/>
-        </w:rPr>
-        <w:t>tudents also experience long queues when fetching their cards. Also, due to the large number of students, the process becomes tiring to the staff, and with a fixed window for the staff (working hours), it takes days to complete the process for all students.</w:t>
+        <w:t>From my observation, the process of issuing cards to registered students includes a wait period of about a week after registration up to the card availability. Thereafter, students also experience long queues when fetching their cards. Also, due to the large number of students, the process becomes tiring to the staff, and with a fixed window for the staff (working hours), it takes days to complete the process for all students.</w:t>
       </w:r>
     </w:p>
     <w:p>
@@ -169,23 +137,7 @@
           <w:sz w:val="22"/>
           <w:szCs w:val="22"/>
         </w:rPr>
-        <w:t xml:space="preserve">Design a system that integrates software and hardware. Software includes the user interaction logic (authentication, computer vision, and logging) and the back-end communication for data validation and checks. Hardware includes a control system able to accept user entries, help authorize the user, and eject the </w:t>
-      </w:r>
-      <w:r>
-        <w:rPr>
-          <w:rFonts w:ascii="Courier New" w:hAnsi="Courier New"/>
-          <w:sz w:val="22"/>
-          <w:szCs w:val="22"/>
-        </w:rPr>
-        <w:t xml:space="preserve">ready printed </w:t>
-      </w:r>
-      <w:r>
-        <w:rPr>
-          <w:rFonts w:ascii="Courier New" w:hAnsi="Courier New"/>
-          <w:sz w:val="22"/>
-          <w:szCs w:val="22"/>
-        </w:rPr>
-        <w:t>card on demand. In addition to that, the system design aims to have the capability to provide the service at all times (24/7).</w:t>
+        <w:t>Design a system that integrates software and hardware. Software includes the user interaction logic (authentication, computer vision, and logging) and the back-end communication for data validation and checks. Hardware includes a control system able to accept user entries, help authorize the user, and eject the ready printed card on demand. In addition to that, the system design aims to have the capability to provide the service at all times (24/7).</w:t>
       </w:r>
     </w:p>
     <w:p>
@@ -295,7 +247,27 @@
           <w:sz w:val="22"/>
           <w:szCs w:val="22"/>
         </w:rPr>
-        <w:t>To integrate a card-printing module with the embedded hardware.</w:t>
+        <w:t>To integrate a card-</w:t>
+      </w:r>
+      <w:r>
+        <w:rPr>
+          <w:rFonts w:ascii="Courier New" w:hAnsi="Courier New"/>
+          <w:b w:val="false"/>
+          <w:bCs w:val="false"/>
+          <w:sz w:val="22"/>
+          <w:szCs w:val="22"/>
+        </w:rPr>
+        <w:t>sorting</w:t>
+      </w:r>
+      <w:r>
+        <w:rPr>
+          <w:rFonts w:ascii="Courier New" w:hAnsi="Courier New"/>
+          <w:b w:val="false"/>
+          <w:bCs w:val="false"/>
+          <w:sz w:val="22"/>
+          <w:szCs w:val="22"/>
+        </w:rPr>
+        <w:t xml:space="preserve"> module with the embedded hardware.</w:t>
       </w:r>
     </w:p>
     <w:p>
@@ -750,8 +722,8 @@
       <w:lang w:val="en-GB" w:eastAsia="zh-CN" w:bidi="hi-IN"/>
     </w:rPr>
   </w:style>
-  <w:style w:type="character" w:styleId="Bulletsuser">
-    <w:name w:val="Bullets (user)"/>
+  <w:style w:type="character" w:styleId="Bullets">
+    <w:name w:val="Bullets"/>
     <w:qFormat/>
     <w:rPr>
       <w:rFonts w:ascii="OpenSymbol" w:hAnsi="OpenSymbol" w:eastAsia="OpenSymbol" w:cs="OpenSymbol"/>

</xml_diff>

<commit_message>
Updated concept note - more technical
</commit_message>
<xml_diff>
--- a/docs/concept-note.docx
+++ b/docs/concept-note.docx
@@ -10,8 +10,8 @@
         <w:jc w:val="center"/>
         <w:rPr>
           <w:rFonts w:ascii="Courier New" w:hAnsi="Courier New"/>
-          <w:sz w:val="22"/>
-          <w:szCs w:val="22"/>
+          <w:sz w:val="24"/>
+          <w:szCs w:val="24"/>
         </w:rPr>
       </w:pPr>
       <w:r>
@@ -19,8 +19,8 @@
           <w:rFonts w:ascii="Courier New" w:hAnsi="Courier New"/>
           <w:b/>
           <w:bCs/>
-          <w:sz w:val="22"/>
-          <w:szCs w:val="22"/>
+          <w:sz w:val="24"/>
+          <w:szCs w:val="24"/>
         </w:rPr>
         <w:t>CONCEPT NOTE</w:t>
       </w:r>
@@ -33,8 +33,8 @@
         <w:jc w:val="both"/>
         <w:rPr>
           <w:rFonts w:ascii="Courier New" w:hAnsi="Courier New"/>
-          <w:sz w:val="22"/>
-          <w:szCs w:val="22"/>
+          <w:sz w:val="24"/>
+          <w:szCs w:val="24"/>
         </w:rPr>
       </w:pPr>
       <w:r>
@@ -42,8 +42,8 @@
           <w:rFonts w:ascii="Courier New" w:hAnsi="Courier New"/>
           <w:b/>
           <w:bCs/>
-          <w:sz w:val="22"/>
-          <w:szCs w:val="22"/>
+          <w:sz w:val="24"/>
+          <w:szCs w:val="24"/>
         </w:rPr>
         <w:t xml:space="preserve">Proposed title: </w:t>
       </w:r>
@@ -52,8 +52,8 @@
           <w:rFonts w:ascii="Courier New" w:hAnsi="Courier New"/>
           <w:b w:val="false"/>
           <w:bCs w:val="false"/>
-          <w:sz w:val="22"/>
-          <w:szCs w:val="22"/>
+          <w:sz w:val="24"/>
+          <w:szCs w:val="24"/>
         </w:rPr>
         <w:t>Automated self-service ID card issuance dispenser.</w:t>
       </w:r>
@@ -66,8 +66,8 @@
         <w:jc w:val="both"/>
         <w:rPr>
           <w:rFonts w:ascii="Courier New" w:hAnsi="Courier New"/>
-          <w:sz w:val="22"/>
-          <w:szCs w:val="22"/>
+          <w:sz w:val="24"/>
+          <w:szCs w:val="24"/>
         </w:rPr>
       </w:pPr>
       <w:r>
@@ -75,8 +75,8 @@
           <w:rFonts w:ascii="Courier New" w:hAnsi="Courier New"/>
           <w:b/>
           <w:bCs/>
-          <w:sz w:val="22"/>
-          <w:szCs w:val="22"/>
+          <w:sz w:val="24"/>
+          <w:szCs w:val="24"/>
         </w:rPr>
         <w:t>Problem Statement:</w:t>
       </w:r>
@@ -85,30 +85,30 @@
           <w:rFonts w:ascii="Courier New" w:hAnsi="Courier New"/>
           <w:b w:val="false"/>
           <w:bCs w:val="false"/>
-          <w:sz w:val="22"/>
-          <w:szCs w:val="22"/>
+          <w:sz w:val="24"/>
+          <w:szCs w:val="24"/>
         </w:rPr>
         <w:t xml:space="preserve"> </w:t>
       </w:r>
       <w:r>
         <w:rPr>
           <w:rFonts w:ascii="Courier New" w:hAnsi="Courier New"/>
-          <w:sz w:val="22"/>
-          <w:szCs w:val="22"/>
-        </w:rPr>
-        <w:t>From my observation, the process of issuing cards to registered students includes a wait period of about a week after registration up to the card availability. Thereafter, students also experience long queues when fetching their cards. Also, due to the large number of students, the process becomes tiring to the staff, and with a fixed window for the staff (working hours), it takes days to complete the process for all students.</w:t>
-      </w:r>
-    </w:p>
-    <w:p>
-      <w:pPr>
-        <w:pStyle w:val="Normal"/>
-        <w:bidi w:val="0"/>
-        <w:spacing w:lineRule="auto" w:line="360"/>
-        <w:jc w:val="both"/>
-        <w:rPr>
-          <w:rFonts w:ascii="Courier New" w:hAnsi="Courier New"/>
-          <w:sz w:val="22"/>
-          <w:szCs w:val="22"/>
+          <w:sz w:val="24"/>
+          <w:szCs w:val="24"/>
+        </w:rPr>
+        <w:t>The current student ID card issuance process involves a waiting period of approximately one week after registration due to delayed card availability in the individual’s college. After release, the card collection also requires students to queue and sort a bunch of ID cards. So, for a high volume of students, the staff responsible suffers significant work strain. On top of that, fixed hours also hinder the sorting capacity of students' issuance per time. As a result, card issuance for registered students takes up to several days, which may bring inconvenience to students.</w:t>
+      </w:r>
+    </w:p>
+    <w:p>
+      <w:pPr>
+        <w:pStyle w:val="Normal"/>
+        <w:bidi w:val="0"/>
+        <w:spacing w:lineRule="auto" w:line="360"/>
+        <w:jc w:val="both"/>
+        <w:rPr>
+          <w:rFonts w:ascii="Courier New" w:hAnsi="Courier New"/>
+          <w:sz w:val="24"/>
+          <w:szCs w:val="24"/>
         </w:rPr>
       </w:pPr>
       <w:r>
@@ -116,8 +116,8 @@
           <w:rFonts w:ascii="Courier New" w:hAnsi="Courier New"/>
           <w:b/>
           <w:bCs/>
-          <w:sz w:val="22"/>
-          <w:szCs w:val="22"/>
+          <w:sz w:val="24"/>
+          <w:szCs w:val="24"/>
         </w:rPr>
         <w:t>Proposed solution:</w:t>
       </w:r>
@@ -126,30 +126,30 @@
           <w:rFonts w:ascii="Courier New" w:hAnsi="Courier New"/>
           <w:b w:val="false"/>
           <w:bCs w:val="false"/>
-          <w:sz w:val="22"/>
-          <w:szCs w:val="22"/>
+          <w:sz w:val="24"/>
+          <w:szCs w:val="24"/>
         </w:rPr>
         <w:t xml:space="preserve"> </w:t>
       </w:r>
       <w:r>
         <w:rPr>
           <w:rFonts w:ascii="Courier New" w:hAnsi="Courier New"/>
-          <w:sz w:val="22"/>
-          <w:szCs w:val="22"/>
-        </w:rPr>
-        <w:t>Design a system that integrates software and hardware. Software includes the user interaction logic (authentication, computer vision, and logging) and the back-end communication for data validation and checks. Hardware includes a control system able to accept user entries, help authorize the user, and eject the ready printed card on demand. In addition to that, the system design aims to have the capability to provide the service at all times (24/7).</w:t>
-      </w:r>
-    </w:p>
-    <w:p>
-      <w:pPr>
-        <w:pStyle w:val="Normal"/>
-        <w:bidi w:val="0"/>
-        <w:spacing w:lineRule="auto" w:line="360"/>
-        <w:jc w:val="both"/>
-        <w:rPr>
-          <w:rFonts w:ascii="Courier New" w:hAnsi="Courier New"/>
-          <w:sz w:val="22"/>
-          <w:szCs w:val="22"/>
+          <w:sz w:val="24"/>
+          <w:szCs w:val="24"/>
+        </w:rPr>
+        <w:t>Design of an automated embedded system for students’ ID card issuance aimed at reducing delays, long queues, and staff dependency. The software handles user interaction, authentication, logging, and back-end validation of students’ information, while the hardware comprises of embedded unit with user input and card dispensing mechanisms. This is aimed to work 24/7 with efficiency and reliability for service delivery for a large student group.</w:t>
+      </w:r>
+    </w:p>
+    <w:p>
+      <w:pPr>
+        <w:pStyle w:val="Normal"/>
+        <w:bidi w:val="0"/>
+        <w:spacing w:lineRule="auto" w:line="360"/>
+        <w:jc w:val="both"/>
+        <w:rPr>
+          <w:rFonts w:ascii="Courier New" w:hAnsi="Courier New"/>
+          <w:sz w:val="24"/>
+          <w:szCs w:val="24"/>
         </w:rPr>
       </w:pPr>
       <w:r>
@@ -157,8 +157,8 @@
           <w:rFonts w:ascii="Courier New" w:hAnsi="Courier New"/>
           <w:b/>
           <w:bCs/>
-          <w:sz w:val="22"/>
-          <w:szCs w:val="22"/>
+          <w:sz w:val="24"/>
+          <w:szCs w:val="24"/>
         </w:rPr>
         <w:t>Main Objective:</w:t>
       </w:r>
@@ -167,8 +167,8 @@
           <w:rFonts w:ascii="Courier New" w:hAnsi="Courier New"/>
           <w:b w:val="false"/>
           <w:bCs w:val="false"/>
-          <w:sz w:val="22"/>
-          <w:szCs w:val="22"/>
+          <w:sz w:val="24"/>
+          <w:szCs w:val="24"/>
         </w:rPr>
         <w:t xml:space="preserve"> To design and implement an automated self-service ID card issuance dispenser.</w:t>
       </w:r>
@@ -181,8 +181,8 @@
         <w:jc w:val="both"/>
         <w:rPr>
           <w:rFonts w:ascii="Courier New" w:hAnsi="Courier New"/>
-          <w:sz w:val="22"/>
-          <w:szCs w:val="22"/>
+          <w:sz w:val="24"/>
+          <w:szCs w:val="24"/>
         </w:rPr>
       </w:pPr>
       <w:r>
@@ -190,8 +190,8 @@
           <w:rFonts w:ascii="Courier New" w:hAnsi="Courier New"/>
           <w:b/>
           <w:bCs/>
-          <w:sz w:val="22"/>
-          <w:szCs w:val="22"/>
+          <w:sz w:val="24"/>
+          <w:szCs w:val="24"/>
         </w:rPr>
         <w:t>Specific Objectives:</w:t>
       </w:r>
@@ -208,17 +208,17 @@
         <w:jc w:val="both"/>
         <w:rPr>
           <w:rFonts w:ascii="Courier New" w:hAnsi="Courier New"/>
-          <w:sz w:val="22"/>
-          <w:szCs w:val="22"/>
-        </w:rPr>
-      </w:pPr>
-      <w:r>
-        <w:rPr>
-          <w:rFonts w:ascii="Courier New" w:hAnsi="Courier New"/>
-          <w:b w:val="false"/>
-          <w:bCs w:val="false"/>
-          <w:sz w:val="22"/>
-          <w:szCs w:val="22"/>
+          <w:sz w:val="24"/>
+          <w:szCs w:val="24"/>
+        </w:rPr>
+      </w:pPr>
+      <w:r>
+        <w:rPr>
+          <w:rFonts w:ascii="Courier New" w:hAnsi="Courier New"/>
+          <w:b w:val="false"/>
+          <w:bCs w:val="false"/>
+          <w:sz w:val="24"/>
+          <w:szCs w:val="24"/>
         </w:rPr>
         <w:t>To design and implement embedded control hardware (micro-controller based system controlling all activities).</w:t>
       </w:r>
@@ -235,39 +235,19 @@
         <w:jc w:val="both"/>
         <w:rPr>
           <w:rFonts w:ascii="Courier New" w:hAnsi="Courier New"/>
-          <w:sz w:val="22"/>
-          <w:szCs w:val="22"/>
-        </w:rPr>
-      </w:pPr>
-      <w:r>
-        <w:rPr>
-          <w:rFonts w:ascii="Courier New" w:hAnsi="Courier New"/>
-          <w:b w:val="false"/>
-          <w:bCs w:val="false"/>
-          <w:sz w:val="22"/>
-          <w:szCs w:val="22"/>
-        </w:rPr>
-        <w:t>To integrate a card-</w:t>
-      </w:r>
-      <w:r>
-        <w:rPr>
-          <w:rFonts w:ascii="Courier New" w:hAnsi="Courier New"/>
-          <w:b w:val="false"/>
-          <w:bCs w:val="false"/>
-          <w:sz w:val="22"/>
-          <w:szCs w:val="22"/>
-        </w:rPr>
-        <w:t>sorting</w:t>
-      </w:r>
-      <w:r>
-        <w:rPr>
-          <w:rFonts w:ascii="Courier New" w:hAnsi="Courier New"/>
-          <w:b w:val="false"/>
-          <w:bCs w:val="false"/>
-          <w:sz w:val="22"/>
-          <w:szCs w:val="22"/>
-        </w:rPr>
-        <w:t xml:space="preserve"> module with the embedded hardware.</w:t>
+          <w:sz w:val="24"/>
+          <w:szCs w:val="24"/>
+        </w:rPr>
+      </w:pPr>
+      <w:r>
+        <w:rPr>
+          <w:rFonts w:ascii="Courier New" w:hAnsi="Courier New"/>
+          <w:b w:val="false"/>
+          <w:bCs w:val="false"/>
+          <w:sz w:val="24"/>
+          <w:szCs w:val="24"/>
+        </w:rPr>
+        <w:t>To integrate a card-sorting module with the embedded hardware.</w:t>
       </w:r>
     </w:p>
     <w:p>
@@ -282,17 +262,17 @@
         <w:jc w:val="both"/>
         <w:rPr>
           <w:rFonts w:ascii="Courier New" w:hAnsi="Courier New"/>
-          <w:sz w:val="22"/>
-          <w:szCs w:val="22"/>
-        </w:rPr>
-      </w:pPr>
-      <w:r>
-        <w:rPr>
-          <w:rFonts w:ascii="Courier New" w:hAnsi="Courier New"/>
-          <w:b w:val="false"/>
-          <w:bCs w:val="false"/>
-          <w:sz w:val="22"/>
-          <w:szCs w:val="22"/>
+          <w:sz w:val="24"/>
+          <w:szCs w:val="24"/>
+        </w:rPr>
+      </w:pPr>
+      <w:r>
+        <w:rPr>
+          <w:rFonts w:ascii="Courier New" w:hAnsi="Courier New"/>
+          <w:b w:val="false"/>
+          <w:bCs w:val="false"/>
+          <w:sz w:val="24"/>
+          <w:szCs w:val="24"/>
         </w:rPr>
         <w:t>To establish back-end connection for identity verification.</w:t>
       </w:r>
@@ -309,17 +289,17 @@
         <w:jc w:val="both"/>
         <w:rPr>
           <w:rFonts w:ascii="Courier New" w:hAnsi="Courier New"/>
-          <w:sz w:val="22"/>
-          <w:szCs w:val="22"/>
-        </w:rPr>
-      </w:pPr>
-      <w:r>
-        <w:rPr>
-          <w:rFonts w:ascii="Courier New" w:hAnsi="Courier New"/>
-          <w:b w:val="false"/>
-          <w:bCs w:val="false"/>
-          <w:sz w:val="22"/>
-          <w:szCs w:val="22"/>
+          <w:sz w:val="24"/>
+          <w:szCs w:val="24"/>
+        </w:rPr>
+      </w:pPr>
+      <w:r>
+        <w:rPr>
+          <w:rFonts w:ascii="Courier New" w:hAnsi="Courier New"/>
+          <w:b w:val="false"/>
+          <w:bCs w:val="false"/>
+          <w:sz w:val="24"/>
+          <w:szCs w:val="24"/>
         </w:rPr>
         <w:t>Provide user interaction and feedback mechanisms.</w:t>
       </w:r>
@@ -336,17 +316,17 @@
         <w:jc w:val="both"/>
         <w:rPr>
           <w:rFonts w:ascii="Courier New" w:hAnsi="Courier New"/>
-          <w:sz w:val="22"/>
-          <w:szCs w:val="22"/>
-        </w:rPr>
-      </w:pPr>
-      <w:r>
-        <w:rPr>
-          <w:rFonts w:ascii="Courier New" w:hAnsi="Courier New"/>
-          <w:b w:val="false"/>
-          <w:bCs w:val="false"/>
-          <w:sz w:val="22"/>
-          <w:szCs w:val="22"/>
+          <w:sz w:val="24"/>
+          <w:szCs w:val="24"/>
+        </w:rPr>
+      </w:pPr>
+      <w:r>
+        <w:rPr>
+          <w:rFonts w:ascii="Courier New" w:hAnsi="Courier New"/>
+          <w:b w:val="false"/>
+          <w:bCs w:val="false"/>
+          <w:sz w:val="24"/>
+          <w:szCs w:val="24"/>
         </w:rPr>
         <w:t>Implement secure card issuance, logging (one card per semester) and handle incomplete issuances.</w:t>
       </w:r>
@@ -363,17 +343,17 @@
         <w:jc w:val="both"/>
         <w:rPr>
           <w:rFonts w:ascii="Courier New" w:hAnsi="Courier New"/>
-          <w:sz w:val="22"/>
-          <w:szCs w:val="22"/>
-        </w:rPr>
-      </w:pPr>
-      <w:r>
-        <w:rPr>
-          <w:rFonts w:ascii="Courier New" w:hAnsi="Courier New"/>
-          <w:b w:val="false"/>
-          <w:bCs w:val="false"/>
-          <w:sz w:val="22"/>
-          <w:szCs w:val="22"/>
+          <w:sz w:val="24"/>
+          <w:szCs w:val="24"/>
+        </w:rPr>
+      </w:pPr>
+      <w:r>
+        <w:rPr>
+          <w:rFonts w:ascii="Courier New" w:hAnsi="Courier New"/>
+          <w:b w:val="false"/>
+          <w:bCs w:val="false"/>
+          <w:sz w:val="24"/>
+          <w:szCs w:val="24"/>
         </w:rPr>
         <w:t>Handle failures and recovery (power, module malfunctions and communication errors).</w:t>
       </w:r>
@@ -390,17 +370,17 @@
         <w:jc w:val="both"/>
         <w:rPr>
           <w:rFonts w:ascii="Courier New" w:hAnsi="Courier New"/>
-          <w:sz w:val="22"/>
-          <w:szCs w:val="22"/>
-        </w:rPr>
-      </w:pPr>
-      <w:r>
-        <w:rPr>
-          <w:rFonts w:ascii="Courier New" w:hAnsi="Courier New"/>
-          <w:b w:val="false"/>
-          <w:bCs w:val="false"/>
-          <w:sz w:val="22"/>
-          <w:szCs w:val="22"/>
+          <w:sz w:val="24"/>
+          <w:szCs w:val="24"/>
+        </w:rPr>
+      </w:pPr>
+      <w:r>
+        <w:rPr>
+          <w:rFonts w:ascii="Courier New" w:hAnsi="Courier New"/>
+          <w:b w:val="false"/>
+          <w:bCs w:val="false"/>
+          <w:sz w:val="24"/>
+          <w:szCs w:val="24"/>
         </w:rPr>
         <w:t>To test a fully implemented prototype.</w:t>
       </w:r>
@@ -722,8 +702,8 @@
       <w:lang w:val="en-GB" w:eastAsia="zh-CN" w:bidi="hi-IN"/>
     </w:rPr>
   </w:style>
-  <w:style w:type="character" w:styleId="Bullets">
-    <w:name w:val="Bullets"/>
+  <w:style w:type="character" w:styleId="Bulletsuser">
+    <w:name w:val="Bullets (user)"/>
     <w:qFormat/>
     <w:rPr>
       <w:rFonts w:ascii="OpenSymbol" w:hAnsi="OpenSymbol" w:eastAsia="OpenSymbol" w:cs="OpenSymbol"/>

</xml_diff>